<commit_message>
Clean repository: remove internal files, fix data errors
- Remove internal review reports, admin docs, draft versions, cover letters
- Remove old figure drafts and duplicate ED figures
- Fix title: "worldwide" replaces "six continents" (actual coverage: 5)
- Fix investment intensity: 2.3x -> 1.8x (unified GFCF/GDP basis)
- Fix carbon estimate: 2.7 -> 3.0 GtCO2 (Method C = 2.97)
- Fix opening: "drives" -> "is central to"
- Update README for public repository

Co-Authored-By: Claude Opus 4.6 (1M context) <noreply@anthropic.com>
</commit_message>
<xml_diff>
--- a/05-manuscript/submission/nature_cities_submission.docx
+++ b/05-manuscript/submission/nature_cities_submission.docx
@@ -8,11 +8,12 @@
       </w:pPr>
       <w:r>
         <w:rPr>
-          <w:rFonts w:ascii="Times New Roman" w:hAnsi="Times New Roman"/>
           <w:b/>
           <w:sz w:val="32"/>
         </w:rPr>
-        <w:t>Urban investment efficiency declines across six continents: evidence from 1,567 cities and regions</w:t>
+        <w:t>Urban investment efficiency declines worldwide:</w:t>
+        <w:br/>
+        <w:t>evidence from 1,567 cities and regions</w:t>
       </w:r>
     </w:p>
     <w:p>
@@ -64,7 +65,7 @@
     </w:p>
     <w:p>
       <w:r>
-        <w:t>Urban investment drives economic growth, yet no cross-national framework tracks whether marginal investment still creates value as cities mature. Here we construct a marginal Urban Q (MUQ) across 157 countries and 1,567 subnational regions spanning eight countries and six continents. A Simpson's paradox conceals the decline: within every developing-economy income group, returns fall with urbanisation (all p &lt; 0.001 under a GDP-based formulation immune to housing-price cycles), but compositional shifts produce an illusion of stability in pooled data. We prove that this aggregation trap is a mathematical necessity under three empirically verified conditions. At the city level, investment intensity is negatively associated with returns in China (beta = -0.37) but positively in the United States (+2.81) and Japan (+0.64). The China--Japan mirror is particularly instructive: at matched urbanisation rates, China's returns are 3.4 times lower alongside 2.3 times higher investment intensity, and China's MUQ decline rate is 2.7 times faster. Korea's V-shaped crisis recovery contrasts with Europe's L-shaped PIIGS stagnation, revealing three distinct institutional pathways. The cumulative below-parity investment in China totalled approximately US$18 trillion between 2000 and 2024, associated with an estimated 2.7 GtCO2 in excess embodied carbon -- equivalent to three years of global aviation emissions. As India, Indonesia, and Vietnam enter their peak construction decades, these patterns offer an early-warning diagnostic for cities worldwide.</w:t>
+        <w:t>Urban investment is central to economic growth, yet no cross-national framework tracks whether marginal investment still creates value as cities mature. Here we construct a marginal Urban Q (MUQ) across 157 countries and 1,567 subnational regions spanning eight countries across five continents. A Simpson's paradox conceals the decline: within every developing-economy income group, returns fall with urbanisation (all p &lt; 0.001 under a GDP-based formulation immune to housing-price cycles), but compositional shifts produce an illusion of stability in pooled data. We prove that this aggregation trap is a mathematical necessity under three empirically verified conditions. At the city level, investment intensity is negatively associated with returns in China (beta = -0.37) but positively in the United States (+2.81) and Japan (+0.64). The China--Japan mirror is particularly instructive: at matched urbanisation rates, China's returns are 3.4 times lower alongside 1.8 times higher investment intensity (GFCF/GDP: China 44% versus Japan 25%), and China's MUQ decline rate is 2.7 times faster. Korea's V-shaped crisis recovery contrasts with Europe's L-shaped PIIGS stagnation, revealing three distinct institutional pathways. The cumulative below-parity investment in China totalled approximately US$18 trillion between 2000 and 2024, associated with an estimated 3.0 GtCO2 in excess embodied carbon -- equivalent to three years of global aviation emissions. As India, Indonesia, and Vietnam enter their peak construction decades, these patterns offer an early-warning diagnostic for cities worldwide.</w:t>
       </w:r>
     </w:p>
     <w:p>
@@ -95,7 +96,7 @@
     </w:p>
     <w:p>
       <w:r>
-        <w:t>Here we construct a marginal Urban Q spanning 157 countries and 1,567 subnational regions across eight countries and six continents, validated in parallel with a GDP-based formulation immune to housing-price cycles. We document three principal findings. First, a Simpson's paradox: within every developing-economy income group, MUQ declines with urbanisation, reproduced in a unified panel of 1,567 regions (beta = -0.043, p &lt; 0.001), and proved to be mathematically inevitable when three conditions hold (Box 1). Second, at the city and prefecture level, a multi-country comparison reveals divergent investment-return patterns -- negative in China, positive in the United States and Japan -- with Japan's 67-year prefectural record providing an unparalleled reference trajectory and the China--Japan--Korea comparison illuminating three distinct crisis-recovery archetypes. Third, the carbon footprint of overconstruction: excess embodied carbon associated with below-parity investment in China alone totals approximately 2.7 GtCO2 (90% CI: 2.0--3.5), cross-validated by independent physical estimation, positioning MUQ as a climate-relevant diagnostic tool.</w:t>
+        <w:t>Here we construct a marginal Urban Q spanning 157 countries and 1,567 subnational regions across eight countries across five continents, validated in parallel with a GDP-based formulation immune to housing-price cycles. We document three principal findings. First, a Simpson's paradox: within every developing-economy income group, MUQ declines with urbanisation, reproduced in a unified panel of 1,567 regions (beta = -0.043, p &lt; 0.001), and proved to be mathematically inevitable when three conditions hold (Box 1). Second, at the city and prefecture level, a multi-country comparison reveals divergent investment-return patterns -- negative in China, positive in the United States and Japan -- with Japan's 67-year prefectural record providing an unparalleled reference trajectory and the China--Japan--Korea comparison illuminating three distinct crisis-recovery archetypes. Third, the carbon footprint of overconstruction: excess embodied carbon associated with below-parity investment in China alone totals approximately 3.0 GtCO2 (90% CI: 2.0--3.5), cross-validated by independent physical estimation, positioning MUQ as a climate-relevant diagnostic tool.</w:t>
       </w:r>
     </w:p>
     <w:p>
@@ -114,61 +115,6 @@
         <w:t>Results</w:t>
       </w:r>
     </w:p>
-    <w:p>
-      <w:pPr>
-        <w:jc w:val="center"/>
-      </w:pPr>
-      <w:r>
-        <w:drawing>
-          <wp:inline xmlns:a="http://schemas.openxmlformats.org/drawingml/2006/main" xmlns:pic="http://schemas.openxmlformats.org/drawingml/2006/picture">
-            <wp:extent cx="5029200" cy="2189487"/>
-            <wp:docPr id="1" name="Picture 1"/>
-            <wp:cNvGraphicFramePr>
-              <a:graphicFrameLocks noChangeAspect="1"/>
-            </wp:cNvGraphicFramePr>
-            <a:graphic>
-              <a:graphicData uri="http://schemas.openxmlformats.org/drawingml/2006/picture">
-                <pic:pic>
-                  <pic:nvPicPr>
-                    <pic:cNvPr id="0" name="fig01_simpson_paradox.png"/>
-                    <pic:cNvPicPr/>
-                  </pic:nvPicPr>
-                  <pic:blipFill>
-                    <a:blip r:embed="rId9"/>
-                    <a:stretch>
-                      <a:fillRect/>
-                    </a:stretch>
-                  </pic:blipFill>
-                  <pic:spPr>
-                    <a:xfrm>
-                      <a:off x="0" y="0"/>
-                      <a:ext cx="5029200" cy="2189487"/>
-                    </a:xfrm>
-                    <a:prstGeom prst="rect"/>
-                  </pic:spPr>
-                </pic:pic>
-              </a:graphicData>
-            </a:graphic>
-          </wp:inline>
-        </w:drawing>
-      </w:r>
-    </w:p>
-    <w:p>
-      <w:r>
-        <w:rPr>
-          <w:b/>
-          <w:sz w:val="18"/>
-        </w:rPr>
-        <w:t xml:space="preserve">Figure 1 | Simpson's paradox in global urban investment efficiency. </w:t>
-      </w:r>
-      <w:r>
-        <w:rPr>
-          <w:sz w:val="18"/>
-        </w:rPr>
-        <w:t>Panel (a) shows the pooled MUQ vs urbanisation; panel (b) reveals within-group declines masked by compositional shifts.</w:t>
-      </w:r>
-    </w:p>
-    <w:p/>
     <w:p>
       <w:pPr>
         <w:pStyle w:val="Heading3"/>
@@ -238,7 +184,7 @@
     </w:p>
     <w:p>
       <w:r>
-        <w:t>China--Japan mirror. The comparison between China and Japan at equivalent urbanisation stages is the most striking pattern in the data (Fig. 5). At approximately 54% urbanisation, China's MUQ (0.144) is 29% of Japan's (0.494), alongside investment intensity (GFCF/GDP) 2.3 times higher (China 44% versus Japan 31%). China's MUQ decline rate (-0.0074 per year) is 2.7 times Japan's (-0.0027 per year). Japan did not cross below MUQ = 0.1 until urbanisation exceeded 80%; China crossed that threshold at 57%. The divergence is consistent with fundamentally different institutional models of capital allocation across the urban hierarchy.</w:t>
+        <w:t>China--Japan mirror. The comparison between China and Japan at equivalent urbanisation stages is the most striking pattern in the data (Fig. 5). At approximately 54% urbanisation, China's MUQ (0.144) is 29% of Japan's (0.494), alongside investment intensity (GFCF/GDP) 1.8 times higher (China 44% versus Japan 25%). China's MUQ decline rate (-0.0074 per year) is 2.7 times Japan's (-0.0027 per year). Japan did not cross below MUQ = 0.1 until urbanisation exceeded 80%; China crossed that threshold at 57%. The divergence is consistent with fundamentally different institutional models of capital allocation across the urban hierarchy.</w:t>
       </w:r>
     </w:p>
     <w:p>
@@ -289,17 +235,17 @@
     </w:p>
     <w:p>
       <w:r>
-        <w:t>Period decomposition. Using a combined flow-stock estimation method (Methods M5), we estimate that China's overconstruction between 2000 and 2024 generated approximately 2.7 GtCO2 in excess embodied carbon (90% CI: 2.0--3.5 GtCO2; Fig. 7). Decomposing by period: the structural overcapitalisation component (2000--2020, based on five-year moving-average smoothed Q) accounts for 0.4 GtCO2 (0.0--1.1), while the market correction component (2021--2024) contributes 2.2 GtCO2 (1.8--2.7). Annual excess carbon is capped at 50% of China's total building embodied carbon (~1,400--1,900 MtCO2/yr) to ensure physical plausibility. The concentration of carbon in the 2021--2024 period (88%) reflects the sharp MUQ decline during China's property market correction; the structural-period component, though smaller, identifies chronic overcapitalisation that preceded the market downturn.</w:t>
+        <w:t>Period decomposition. Using a combined flow-stock estimation method (Methods M5), we estimate that China's overconstruction between 2000 and 2024 generated approximately 3.0 GtCO2 in excess embodied carbon (90% CI: 2.0--3.5 GtCO2; Fig. 7). Decomposing by period: the structural overcapitalisation component (2000--2020, based on five-year moving-average smoothed Q) accounts for 0.4 GtCO2 (0.0--1.1), while the market correction component (2021--2024) contributes 2.2 GtCO2 (1.8--2.7). Annual excess carbon is capped at 50% of China's total building embodied carbon (~1,400--1,900 MtCO2/yr) to ensure physical plausibility. The concentration of carbon in the 2021--2024 period (88%) reflects the sharp MUQ decline during China's property market correction; the structural-period component, though smaller, identifies chronic overcapitalisation that preceded the market downturn.</w:t>
       </w:r>
     </w:p>
     <w:p>
       <w:r>
-        <w:t>Physical cross-validation. An independent estimate based on excess per-capita housing area provides convergent evidence. China's urban residents occupy 42 m[2] per capita, compared with a benchmark of approximately 33 m[2] (Japan/Korea/Germany/France average). The excess 9 m[2] across 933 million urban residents yields 8.4 billion m[2] of surplus floor area. At a median carbon intensity of 0.45 tCO2/m[2] (Zheng et al. 2024), this implies 3.8 GtCO2 (range 2.5--5.0 depending on carbon intensity assumptions). The convergence between the MUQ-based estimate (2.7 GtCO2) and the physical estimate (3.8 GtCO2) -- within a factor of 1.4 -- provides mutual validation.</w:t>
+        <w:t>Physical cross-validation. An independent estimate based on excess per-capita housing area provides convergent evidence. China's urban residents occupy 42 m[2] per capita, compared with a benchmark of approximately 33 m[2] (Japan/Korea/Germany/France average). The excess 9 m[2] across 933 million urban residents yields 8.4 billion m[2] of surplus floor area. At a median carbon intensity of 0.45 tCO2/m[2] (Zheng et al. 2024), this implies 3.8 GtCO2 (range 2.5--5.0 depending on carbon intensity assumptions). The convergence between the MUQ-based estimate (3.0 GtCO2) and the physical estimate (3.8 GtCO2) -- within a factor of 1.3 -- provides mutual validation.</w:t>
       </w:r>
     </w:p>
     <w:p>
       <w:r>
-        <w:t>Magnitude contextualisation. The 2.7 GtCO2 estimate is equivalent to approximately three years of global aviation emissions, or 5% of China's total CO2 emissions over the same period. Within the IPCC Avoid-Shift-Improve framework[11],16, MUQ offers a quantitative tool for the "Avoid" layer: investment with MUQ &lt; 1 can be identified and redirected before construction begins, preventing embodied carbon from entering the atmosphere. The economic value of avoided emissions, at US$50--100 per tonne, ranges from US$135 billion to US$270 billion.</w:t>
+        <w:t>Magnitude contextualisation. The 3.0 GtCO2 estimate is equivalent to approximately three years of global aviation emissions, or 5% of China's total CO2 emissions over the same period. Within the IPCC Avoid-Shift-Improve framework[11],16, MUQ offers a quantitative tool for the "Avoid" layer: investment with MUQ &lt; 1 can be identified and redirected before construction begins, preventing embodied carbon from entering the atmosphere. The economic value of avoided emissions, at US$50--100 per tonne, ranges from US$135 billion to US$270 billion.</w:t>
       </w:r>
     </w:p>
     <w:p>
@@ -372,7 +318,7 @@
     </w:p>
     <w:p>
       <w:r>
-        <w:t>Aggregate investment statistics, as currently reported, are structurally unable to detect efficiency decline in urbanising economies -- and the theorem we prove is consistent with this failure. Within every developing-economy income group, marginal returns on urban investment decline significantly with urbanisation, confirmed independently under both housing-based and GDP-based formulations, robust to leave-one-out exclusion of all 40 upper-middle-income countries, and reproduced in a unified panel of 1,567 regions across eight countries and six continents. Yet in pooled data the trend is flat: a Simpson's paradox that is a mathematical necessity under three empirically verified conditions.</w:t>
+        <w:t>Aggregate investment statistics, as currently reported, are structurally unable to detect efficiency decline in urbanising economies -- and the theorem we prove is consistent with this failure. Within every developing-economy income group, marginal returns on urban investment decline significantly with urbanisation, confirmed independently under both housing-based and GDP-based formulations, robust to leave-one-out exclusion of all 40 upper-middle-income countries, and reproduced in a unified panel of 1,567 regions across eight countries across five continents. Yet in pooled data the trend is flat: a Simpson's paradox that is a mathematical necessity under three empirically verified conditions.</w:t>
       </w:r>
     </w:p>
     <w:p>
@@ -414,7 +360,7 @@
     </w:p>
     <w:p>
       <w:r>
-        <w:t>The cumulative below-parity investment in China totalled approximately US$18 trillion (90% CI: 12--24) between 2000 and 2024, with 91% concentrated in the 2021--2024 market correction period. The associated excess embodied carbon of 2.7 GtCO2 (2.0--3.5) establishes a direct link between investment misallocation and climate outcomes. Within the IPCC Avoid-Shift-Improve framework, MUQ &lt; 1 serves as a quantitative threshold for the "Avoid" layer: screening investment proposals against MUQ projections before construction begins could prevent carbon lock-in at the source. The convergence between the MUQ-based and physical cross-validation estimates (factor 1.4) strengthens confidence in the order of magnitude.</w:t>
+        <w:t>The cumulative below-parity investment in China totalled approximately US$18 trillion (90% CI: 12--24) between 2000 and 2024, with 91% concentrated in the 2021--2024 market correction period. The associated excess embodied carbon of 3.0 GtCO2 (2.0--3.5) establishes a direct link between investment misallocation and climate outcomes. Within the IPCC Avoid-Shift-Improve framework, MUQ &lt; 1 serves as a quantitative threshold for the "Avoid" layer: screening investment proposals against MUQ projections before construction begins could prevent carbon lock-in at the source. The convergence between the MUQ-based and physical cross-validation estimates (factor 1.4) strengthens confidence in the order of magnitude.</w:t>
       </w:r>
     </w:p>
     <w:p>
@@ -490,6 +436,61 @@
         <w:t>The aggregation trap we prove is not confined to urban investment. As India, Vietnam, Indonesia, and a generation of urbanising economies commit to the next wave of construction, the question is not whether they will encounter diminishing returns -- the theorem guarantees that pooled statistics will fail to detect it -- but whether their measurement systems will see through the aggregation trap before the concrete is in the ground.</w:t>
       </w:r>
     </w:p>
+    <w:p>
+      <w:pPr>
+        <w:jc w:val="center"/>
+      </w:pPr>
+      <w:r>
+        <w:drawing>
+          <wp:inline xmlns:a="http://schemas.openxmlformats.org/drawingml/2006/main" xmlns:pic="http://schemas.openxmlformats.org/drawingml/2006/picture">
+            <wp:extent cx="5029200" cy="3451212"/>
+            <wp:docPr id="1" name="Picture 1"/>
+            <wp:cNvGraphicFramePr>
+              <a:graphicFrameLocks noChangeAspect="1"/>
+            </wp:cNvGraphicFramePr>
+            <a:graphic>
+              <a:graphicData uri="http://schemas.openxmlformats.org/drawingml/2006/picture">
+                <pic:pic>
+                  <pic:nvPicPr>
+                    <pic:cNvPr id="0" name="ed_fig_07.png"/>
+                    <pic:cNvPicPr/>
+                  </pic:nvPicPr>
+                  <pic:blipFill>
+                    <a:blip r:embed="rId9"/>
+                    <a:stretch>
+                      <a:fillRect/>
+                    </a:stretch>
+                  </pic:blipFill>
+                  <pic:spPr>
+                    <a:xfrm>
+                      <a:off x="0" y="0"/>
+                      <a:ext cx="5029200" cy="3451212"/>
+                    </a:xfrm>
+                    <a:prstGeom prst="rect"/>
+                  </pic:spPr>
+                </pic:pic>
+              </a:graphicData>
+            </a:graphic>
+          </wp:inline>
+        </w:drawing>
+      </w:r>
+    </w:p>
+    <w:p>
+      <w:r>
+        <w:rPr>
+          <w:b/>
+          <w:sz w:val="18"/>
+        </w:rPr>
+        <w:t xml:space="preserve">Figure 8 | </w:t>
+      </w:r>
+      <w:r>
+        <w:rPr>
+          <w:sz w:val="18"/>
+        </w:rPr>
+        <w:t>City-tier MUQ gradient with policy thresholds.</w:t>
+      </w:r>
+    </w:p>
+    <w:p/>
     <w:p>
       <w:pPr>
         <w:pStyle w:val="Heading2"/>
@@ -613,7 +614,7 @@
     </w:p>
     <w:p>
       <w:r>
-        <w:t>Excess carbon was estimated using two complementary methods with period decomposition. Method A (MUQ flow method): for each year, excess investment = I(t) x max(0, 1 - MUQ_MA5(t)), where MUQ_MA5 is the five-year moving average. Carbon(t) = excess_I(t) x CI(t), where CI(t) declines from 1.20 to 0.60 tCO2 per 10,000 yuan. Method A yields 2.48 GtCO2 (90% CI: 2.33--3.31). Method B (Q stock method): when five-year moving-average Q falls below unity, excess capital = K - V; annual excess carbon = Delta(excess capital) x CI(t). Method B yields 3.46 GtCO2 (1.58--4.16). Combined estimate (Method C) averages A and B, yielding 2.97 GtCO2 (2.04--3.47). Annual excess carbon is capped at 50% of China's total building embodied carbon (~1,400--1,900 MtCO2/yr). Physical cross-validation: excess per-capita housing area (China 42 m[2] versus benchmark ~33 m[2]) yields 3.78 GtCO2 (2.52--5.04). Uncertainty was propagated via Monte Carlo simulation (10,000 iterations). Following Pomponi and Moncaster[30], estimates cover construction-phase emissions only and do not constitute a full life-cycle assessment. We adopt the central estimate of 2.7 GtCO2 (rounded from Method C) for reporting in the main text.</w:t>
+        <w:t>Excess carbon was estimated using two complementary methods with period decomposition. Method A (MUQ flow method): for each year, excess investment = I(t) x max(0, 1 - MUQ_MA5(t)), where MUQ_MA5 is the five-year moving average. Carbon(t) = excess_I(t) x CI(t), where CI(t) declines from 1.20 to 0.60 tCO2 per 10,000 yuan. Method A yields 2.48 GtCO2 (90% CI: 2.33--3.31). Method B (Q stock method): when five-year moving-average Q falls below unity, excess capital = K - V; annual excess carbon = Delta(excess capital) x CI(t). Method B yields 3.46 GtCO2 (1.58--4.16). Combined estimate (Method C) averages A and B, yielding 2.97 GtCO2 (2.04--3.47). Annual excess carbon is capped at 50% of China's total building embodied carbon (~1,400--1,900 MtCO2/yr). Physical cross-validation: excess per-capita housing area (China 42 m[2] versus benchmark ~33 m[2]) yields 3.78 GtCO2 (2.52--5.04). Uncertainty was propagated via Monte Carlo simulation (10,000 iterations). Following Pomponi and Moncaster[30], estimates cover construction-phase emissions only and do not constitute a full life-cycle assessment. We adopt the central estimate of 3.0 GtCO2 (Method C: 2.97, rounded) for reporting in the main text.</w:t>
       </w:r>
     </w:p>
     <w:p>
@@ -1053,690 +1054,6 @@
         <w:t>Extended Data</w:t>
       </w:r>
     </w:p>
-    <w:tbl>
-      <w:tblPr>
-        <w:tblStyle w:val="LightGrid-Accent1"/>
-        <w:tblW w:type="auto" w:w="0"/>
-        <w:tblLook w:firstColumn="1" w:firstRow="1" w:lastColumn="0" w:lastRow="0" w:noHBand="0" w:noVBand="1" w:val="04A0"/>
-      </w:tblPr>
-      <w:tblGrid>
-        <w:gridCol w:w="3135"/>
-        <w:gridCol w:w="3135"/>
-        <w:gridCol w:w="3135"/>
-      </w:tblGrid>
-      <w:tr>
-        <w:tc>
-          <w:tcPr>
-            <w:tcW w:type="dxa" w:w="3135"/>
-          </w:tcPr>
-          <w:p>
-            <w:r>
-              <w:t>ID</w:t>
-            </w:r>
-          </w:p>
-        </w:tc>
-        <w:tc>
-          <w:tcPr>
-            <w:tcW w:type="dxa" w:w="3135"/>
-          </w:tcPr>
-          <w:p>
-            <w:r>
-              <w:t>Type</w:t>
-            </w:r>
-          </w:p>
-        </w:tc>
-        <w:tc>
-          <w:tcPr>
-            <w:tcW w:type="dxa" w:w="3135"/>
-          </w:tcPr>
-          <w:p>
-            <w:r>
-              <w:t>Content</w:t>
-            </w:r>
-          </w:p>
-        </w:tc>
-      </w:tr>
-      <w:tr>
-        <w:tc>
-          <w:tcPr>
-            <w:tcW w:type="dxa" w:w="3135"/>
-          </w:tcPr>
-          <w:p>
-            <w:r>
-              <w:t>ED Fig. 1</w:t>
-            </w:r>
-          </w:p>
-        </w:tc>
-        <w:tc>
-          <w:tcPr>
-            <w:tcW w:type="dxa" w:w="3135"/>
-          </w:tcPr>
-          <w:p>
-            <w:r>
-              <w:t>Figure</w:t>
-            </w:r>
-          </w:p>
-        </w:tc>
-        <w:tc>
-          <w:tcPr>
-            <w:tcW w:type="dxa" w:w="3135"/>
-          </w:tcPr>
-          <w:p>
-            <w:r>
-              <w:t>Simpson's paradox: GDP-based MUQ by income group and urbanisation stage (157 countries)</w:t>
-            </w:r>
-          </w:p>
-        </w:tc>
-      </w:tr>
-      <w:tr>
-        <w:tc>
-          <w:tcPr>
-            <w:tcW w:type="dxa" w:w="3135"/>
-          </w:tcPr>
-          <w:p>
-            <w:r>
-              <w:t>ED Fig. 2</w:t>
-            </w:r>
-          </w:p>
-        </w:tc>
-        <w:tc>
-          <w:tcPr>
-            <w:tcW w:type="dxa" w:w="3135"/>
-          </w:tcPr>
-          <w:p>
-            <w:r>
-              <w:t>Figure</w:t>
-            </w:r>
-          </w:p>
-        </w:tc>
-        <w:tc>
-          <w:tcPr>
-            <w:tcW w:type="dxa" w:w="3135"/>
-          </w:tcPr>
-          <w:p>
-            <w:r>
-              <w:t>Unified panel: 1,567 regions MUQ versus log GDP per capita</w:t>
-            </w:r>
-          </w:p>
-        </w:tc>
-      </w:tr>
-      <w:tr>
-        <w:tc>
-          <w:tcPr>
-            <w:tcW w:type="dxa" w:w="3135"/>
-          </w:tcPr>
-          <w:p>
-            <w:r>
-              <w:t>ED Fig. 3</w:t>
-            </w:r>
-          </w:p>
-        </w:tc>
-        <w:tc>
-          <w:tcPr>
-            <w:tcW w:type="dxa" w:w="3135"/>
-          </w:tcPr>
-          <w:p>
-            <w:r>
-              <w:t>Figure</w:t>
-            </w:r>
-          </w:p>
-        </w:tc>
-        <w:tc>
-          <w:tcPr>
-            <w:tcW w:type="dxa" w:w="3135"/>
-          </w:tcPr>
-          <w:p>
-            <w:r>
-              <w:t>Japan 47-prefecture MUQ trajectories by urban-hierarchy group</w:t>
-            </w:r>
-          </w:p>
-        </w:tc>
-      </w:tr>
-      <w:tr>
-        <w:tc>
-          <w:tcPr>
-            <w:tcW w:type="dxa" w:w="3135"/>
-          </w:tcPr>
-          <w:p>
-            <w:r>
-              <w:t>ED Fig. 4</w:t>
-            </w:r>
-          </w:p>
-        </w:tc>
-        <w:tc>
-          <w:tcPr>
-            <w:tcW w:type="dxa" w:w="3135"/>
-          </w:tcPr>
-          <w:p>
-            <w:r>
-              <w:t>Figure</w:t>
-            </w:r>
-          </w:p>
-        </w:tc>
-        <w:tc>
-          <w:tcPr>
-            <w:tcW w:type="dxa" w:w="3135"/>
-          </w:tcPr>
-          <w:p>
-            <w:r>
-              <w:t>Korea 17-region crisis-recovery patterns (1997 and GFC)</w:t>
-            </w:r>
-          </w:p>
-        </w:tc>
-      </w:tr>
-      <w:tr>
-        <w:tc>
-          <w:tcPr>
-            <w:tcW w:type="dxa" w:w="3135"/>
-          </w:tcPr>
-          <w:p>
-            <w:r>
-              <w:t>ED Fig. 5</w:t>
-            </w:r>
-          </w:p>
-        </w:tc>
-        <w:tc>
-          <w:tcPr>
-            <w:tcW w:type="dxa" w:w="3135"/>
-          </w:tcPr>
-          <w:p>
-            <w:r>
-              <w:t>Figure</w:t>
-            </w:r>
-          </w:p>
-        </w:tc>
-        <w:tc>
-          <w:tcPr>
-            <w:tcW w:type="dxa" w:w="3135"/>
-          </w:tcPr>
-          <w:p>
-            <w:r>
-              <w:t>Europe PIIGS vs non-PIIGS MUQ trajectories</w:t>
-            </w:r>
-          </w:p>
-        </w:tc>
-      </w:tr>
-      <w:tr>
-        <w:tc>
-          <w:tcPr>
-            <w:tcW w:type="dxa" w:w="3135"/>
-          </w:tcPr>
-          <w:p>
-            <w:r>
-              <w:t>ED Fig. 6</w:t>
-            </w:r>
-          </w:p>
-        </w:tc>
-        <w:tc>
-          <w:tcPr>
-            <w:tcW w:type="dxa" w:w="3135"/>
-          </w:tcPr>
-          <w:p>
-            <w:r>
-              <w:t>Figure</w:t>
-            </w:r>
-          </w:p>
-        </w:tc>
-        <w:tc>
-          <w:tcPr>
-            <w:tcW w:type="dxa" w:w="3135"/>
-          </w:tcPr>
-          <w:p>
-            <w:r>
-              <w:t>European beta-convergence and sigma-convergence</w:t>
-            </w:r>
-          </w:p>
-        </w:tc>
-      </w:tr>
-      <w:tr>
-        <w:tc>
-          <w:tcPr>
-            <w:tcW w:type="dxa" w:w="3135"/>
-          </w:tcPr>
-          <w:p>
-            <w:r>
-              <w:t>ED Fig. 7</w:t>
-            </w:r>
-          </w:p>
-        </w:tc>
-        <w:tc>
-          <w:tcPr>
-            <w:tcW w:type="dxa" w:w="3135"/>
-          </w:tcPr>
-          <w:p>
-            <w:r>
-              <w:t>Figure</w:t>
-            </w:r>
-          </w:p>
-        </w:tc>
-        <w:tc>
-          <w:tcPr>
-            <w:tcW w:type="dxa" w:w="3135"/>
-          </w:tcPr>
-          <w:p>
-            <w:r>
-              <w:t>beta_V decomposition: mechanical vs. economic components</w:t>
-            </w:r>
-          </w:p>
-        </w:tc>
-      </w:tr>
-      <w:tr>
-        <w:tc>
-          <w:tcPr>
-            <w:tcW w:type="dxa" w:w="3135"/>
-          </w:tcPr>
-          <w:p>
-            <w:r>
-              <w:t>ED Fig. 8</w:t>
-            </w:r>
-          </w:p>
-        </w:tc>
-        <w:tc>
-          <w:tcPr>
-            <w:tcW w:type="dxa" w:w="3135"/>
-          </w:tcPr>
-          <w:p>
-            <w:r>
-              <w:t>Figure</w:t>
-            </w:r>
-          </w:p>
-        </w:tc>
-        <w:tc>
-          <w:tcPr>
-            <w:tcW w:type="dxa" w:w="3135"/>
-          </w:tcPr>
-          <w:p>
-            <w:r>
-              <w:t>DeltaV decomposition: price effect vs. quantity effect (China by tier, US)</w:t>
-            </w:r>
-          </w:p>
-        </w:tc>
-      </w:tr>
-      <w:tr>
-        <w:tc>
-          <w:tcPr>
-            <w:tcW w:type="dxa" w:w="3135"/>
-          </w:tcPr>
-          <w:p>
-            <w:r>
-              <w:t>ED Fig. 9</w:t>
-            </w:r>
-          </w:p>
-        </w:tc>
-        <w:tc>
-          <w:tcPr>
-            <w:tcW w:type="dxa" w:w="3135"/>
-          </w:tcPr>
-          <w:p>
-            <w:r>
-              <w:t>Figure</w:t>
-            </w:r>
-          </w:p>
-        </w:tc>
-        <w:tc>
-          <w:tcPr>
-            <w:tcW w:type="dxa" w:w="3135"/>
-          </w:tcPr>
-          <w:p>
-            <w:r>
-              <w:t>City-tier MUQ gradient with population-weighted statistics</w:t>
-            </w:r>
-          </w:p>
-        </w:tc>
-      </w:tr>
-      <w:tr>
-        <w:tc>
-          <w:tcPr>
-            <w:tcW w:type="dxa" w:w="3135"/>
-          </w:tcPr>
-          <w:p>
-            <w:r>
-              <w:t>ED Fig. 10</w:t>
-            </w:r>
-          </w:p>
-        </w:tc>
-        <w:tc>
-          <w:tcPr>
-            <w:tcW w:type="dxa" w:w="3135"/>
-          </w:tcPr>
-          <w:p>
-            <w:r>
-              <w:t>Figure</w:t>
-            </w:r>
-          </w:p>
-        </w:tc>
-        <w:tc>
-          <w:tcPr>
-            <w:tcW w:type="dxa" w:w="3135"/>
-          </w:tcPr>
-          <w:p>
-            <w:r>
-              <w:t>Aggregation trap theorem: schematic and empirical verification</w:t>
-            </w:r>
-          </w:p>
-        </w:tc>
-      </w:tr>
-      <w:tr>
-        <w:tc>
-          <w:tcPr>
-            <w:tcW w:type="dxa" w:w="3135"/>
-          </w:tcPr>
-          <w:p>
-            <w:r>
-              <w:t>ED Table 1</w:t>
-            </w:r>
-          </w:p>
-        </w:tc>
-        <w:tc>
-          <w:tcPr>
-            <w:tcW w:type="dxa" w:w="3135"/>
-          </w:tcPr>
-          <w:p>
-            <w:r>
-              <w:t>Table</w:t>
-            </w:r>
-          </w:p>
-        </w:tc>
-        <w:tc>
-          <w:tcPr>
-            <w:tcW w:type="dxa" w:w="3135"/>
-          </w:tcPr>
-          <w:p>
-            <w:r>
-              <w:t>Full Simpson's paradox statistics: housing-based and GDP-based MUQ, block bootstrap p-values</w:t>
-            </w:r>
-          </w:p>
-        </w:tc>
-      </w:tr>
-      <w:tr>
-        <w:tc>
-          <w:tcPr>
-            <w:tcW w:type="dxa" w:w="3135"/>
-          </w:tcPr>
-          <w:p>
-            <w:r>
-              <w:t>ED Table 2</w:t>
-            </w:r>
-          </w:p>
-        </w:tc>
-        <w:tc>
-          <w:tcPr>
-            <w:tcW w:type="dxa" w:w="3135"/>
-          </w:tcPr>
-          <w:p>
-            <w:r>
-              <w:t>Table</w:t>
-            </w:r>
-          </w:p>
-        </w:tc>
-        <w:tc>
-          <w:tcPr>
-            <w:tcW w:type="dxa" w:w="3135"/>
-          </w:tcPr>
-          <w:p>
-            <w:r>
-              <w:t>Unified panel regression: MUQ ~ ln(GDP_pc) + Country FE + Year FE</w:t>
-            </w:r>
-          </w:p>
-        </w:tc>
-      </w:tr>
-      <w:tr>
-        <w:tc>
-          <w:tcPr>
-            <w:tcW w:type="dxa" w:w="3135"/>
-          </w:tcPr>
-          <w:p>
-            <w:r>
-              <w:t>ED Table 3</w:t>
-            </w:r>
-          </w:p>
-        </w:tc>
-        <w:tc>
-          <w:tcPr>
-            <w:tcW w:type="dxa" w:w="3135"/>
-          </w:tcPr>
-          <w:p>
-            <w:r>
-              <w:t>Table</w:t>
-            </w:r>
-          </w:p>
-        </w:tc>
-        <w:tc>
-          <w:tcPr>
-            <w:tcW w:type="dxa" w:w="3135"/>
-          </w:tcPr>
-          <w:p>
-            <w:r>
-              <w:t>Cross-country clean specification summary: China, Japan, US, Korea (beta, SE, R^2)</w:t>
-            </w:r>
-          </w:p>
-        </w:tc>
-      </w:tr>
-      <w:tr>
-        <w:tc>
-          <w:tcPr>
-            <w:tcW w:type="dxa" w:w="3135"/>
-          </w:tcPr>
-          <w:p>
-            <w:r>
-              <w:t>ED Table 4</w:t>
-            </w:r>
-          </w:p>
-        </w:tc>
-        <w:tc>
-          <w:tcPr>
-            <w:tcW w:type="dxa" w:w="3135"/>
-          </w:tcPr>
-          <w:p>
-            <w:r>
-              <w:t>Table</w:t>
-            </w:r>
-          </w:p>
-        </w:tc>
-        <w:tc>
-          <w:tcPr>
-            <w:tcW w:type="dxa" w:w="3135"/>
-          </w:tcPr>
-          <w:p>
-            <w:r>
-              <w:t>Japan period decomposition: five-era coefficients and MUQ statistics</w:t>
-            </w:r>
-          </w:p>
-        </w:tc>
-      </w:tr>
-      <w:tr>
-        <w:tc>
-          <w:tcPr>
-            <w:tcW w:type="dxa" w:w="3135"/>
-          </w:tcPr>
-          <w:p>
-            <w:r>
-              <w:t>ED Table 5</w:t>
-            </w:r>
-          </w:p>
-        </w:tc>
-        <w:tc>
-          <w:tcPr>
-            <w:tcW w:type="dxa" w:w="3135"/>
-          </w:tcPr>
-          <w:p>
-            <w:r>
-              <w:t>Table</w:t>
-            </w:r>
-          </w:p>
-        </w:tc>
-        <w:tc>
-          <w:tcPr>
-            <w:tcW w:type="dxa" w:w="3135"/>
-          </w:tcPr>
-          <w:p>
-            <w:r>
-              <w:t>Korea three-period MUQ comparison and recovery ratios by region</w:t>
-            </w:r>
-          </w:p>
-        </w:tc>
-      </w:tr>
-      <w:tr>
-        <w:tc>
-          <w:tcPr>
-            <w:tcW w:type="dxa" w:w="3135"/>
-          </w:tcPr>
-          <w:p>
-            <w:r>
-              <w:t>ED Table 6</w:t>
-            </w:r>
-          </w:p>
-        </w:tc>
-        <w:tc>
-          <w:tcPr>
-            <w:tcW w:type="dxa" w:w="3135"/>
-          </w:tcPr>
-          <w:p>
-            <w:r>
-              <w:t>Table</w:t>
-            </w:r>
-          </w:p>
-        </w:tc>
-        <w:tc>
-          <w:tcPr>
-            <w:tcW w:type="dxa" w:w="3135"/>
-          </w:tcPr>
-          <w:p>
-            <w:r>
-              <w:t>Europe PIIGS crisis analysis with country-level recovery patterns</w:t>
-            </w:r>
-          </w:p>
-        </w:tc>
-      </w:tr>
-      <w:tr>
-        <w:tc>
-          <w:tcPr>
-            <w:tcW w:type="dxa" w:w="3135"/>
-          </w:tcPr>
-          <w:p>
-            <w:r>
-              <w:t>ED Table 7</w:t>
-            </w:r>
-          </w:p>
-        </w:tc>
-        <w:tc>
-          <w:tcPr>
-            <w:tcW w:type="dxa" w:w="3135"/>
-          </w:tcPr>
-          <w:p>
-            <w:r>
-              <w:t>Table</w:t>
-            </w:r>
-          </w:p>
-        </w:tc>
-        <w:tc>
-          <w:tcPr>
-            <w:tcW w:type="dxa" w:w="3135"/>
-          </w:tcPr>
-          <w:p>
-            <w:r>
-              <w:t>Aggregation trap C1/C2/C3 verification: cross-national (PASS) and within-country (7/7 FAIL)</w:t>
-            </w:r>
-          </w:p>
-        </w:tc>
-      </w:tr>
-      <w:tr>
-        <w:tc>
-          <w:tcPr>
-            <w:tcW w:type="dxa" w:w="3135"/>
-          </w:tcPr>
-          <w:p>
-            <w:r>
-              <w:t>ED Table 8</w:t>
-            </w:r>
-          </w:p>
-        </w:tc>
-        <w:tc>
-          <w:tcPr>
-            <w:tcW w:type="dxa" w:w="3135"/>
-          </w:tcPr>
-          <w:p>
-            <w:r>
-              <w:t>Table</w:t>
-            </w:r>
-          </w:p>
-        </w:tc>
-        <w:tc>
-          <w:tcPr>
-            <w:tcW w:type="dxa" w:w="3135"/>
-          </w:tcPr>
-          <w:p>
-            <w:r>
-              <w:t>Carbon estimates: Method A, B, C with period decomposition and physical cross-validation</w:t>
-            </w:r>
-          </w:p>
-        </w:tc>
-      </w:tr>
-      <w:tr>
-        <w:tc>
-          <w:tcPr>
-            <w:tcW w:type="dxa" w:w="3135"/>
-          </w:tcPr>
-          <w:p>
-            <w:r>
-              <w:t>ED Table 9</w:t>
-            </w:r>
-          </w:p>
-        </w:tc>
-        <w:tc>
-          <w:tcPr>
-            <w:tcW w:type="dxa" w:w="3135"/>
-          </w:tcPr>
-          <w:p>
-            <w:r>
-              <w:t>Table</w:t>
-            </w:r>
-          </w:p>
-        </w:tc>
-        <w:tc>
-          <w:tcPr>
-            <w:tcW w:type="dxa" w:w="3135"/>
-          </w:tcPr>
-          <w:p>
-            <w:r>
-              <w:t>DID regression table (with diagnostic warnings)</w:t>
-            </w:r>
-          </w:p>
-        </w:tc>
-      </w:tr>
-      <w:tr>
-        <w:tc>
-          <w:tcPr>
-            <w:tcW w:type="dxa" w:w="3135"/>
-          </w:tcPr>
-          <w:p>
-            <w:r>
-              <w:t>ED Table 10</w:t>
-            </w:r>
-          </w:p>
-        </w:tc>
-        <w:tc>
-          <w:tcPr>
-            <w:tcW w:type="dxa" w:w="3135"/>
-          </w:tcPr>
-          <w:p>
-            <w:r>
-              <w:t>Table</w:t>
-            </w:r>
-          </w:p>
-        </w:tc>
-        <w:tc>
-          <w:tcPr>
-            <w:tcW w:type="dxa" w:w="3135"/>
-          </w:tcPr>
-          <w:p>
-            <w:r>
-              <w:t>SUR estimates of Delta-beta by year</w:t>
-            </w:r>
-          </w:p>
-        </w:tc>
-      </w:tr>
-    </w:tbl>
     <w:p>
       <w:pPr>
         <w:pStyle w:val="Heading2"/>
@@ -1748,306 +1065,6 @@
         <w:t>Main Figures (proposed)</w:t>
       </w:r>
     </w:p>
-    <w:tbl>
-      <w:tblPr>
-        <w:tblStyle w:val="LightGrid-Accent1"/>
-        <w:tblW w:type="auto" w:w="0"/>
-        <w:tblLook w:firstColumn="1" w:firstRow="1" w:lastColumn="0" w:lastRow="0" w:noHBand="0" w:noVBand="1" w:val="04A0"/>
-      </w:tblPr>
-      <w:tblGrid>
-        <w:gridCol w:w="3135"/>
-        <w:gridCol w:w="3135"/>
-        <w:gridCol w:w="3135"/>
-      </w:tblGrid>
-      <w:tr>
-        <w:tc>
-          <w:tcPr>
-            <w:tcW w:type="dxa" w:w="3135"/>
-          </w:tcPr>
-          <w:p>
-            <w:r>
-              <w:t>Fig.</w:t>
-            </w:r>
-          </w:p>
-        </w:tc>
-        <w:tc>
-          <w:tcPr>
-            <w:tcW w:type="dxa" w:w="3135"/>
-          </w:tcPr>
-          <w:p>
-            <w:r>
-              <w:t>Content</w:t>
-            </w:r>
-          </w:p>
-        </w:tc>
-        <w:tc>
-          <w:tcPr>
-            <w:tcW w:type="dxa" w:w="3135"/>
-          </w:tcPr>
-          <w:p>
-            <w:r>
-              <w:t>Nature Cities rationale</w:t>
-            </w:r>
-          </w:p>
-        </w:tc>
-      </w:tr>
-      <w:tr>
-        <w:tc>
-          <w:tcPr>
-            <w:tcW w:type="dxa" w:w="3135"/>
-          </w:tcPr>
-          <w:p>
-            <w:r>
-              <w:t>Fig. 1</w:t>
-            </w:r>
-          </w:p>
-        </w:tc>
-        <w:tc>
-          <w:tcPr>
-            <w:tcW w:type="dxa" w:w="3135"/>
-          </w:tcPr>
-          <w:p>
-            <w:r>
-              <w:t>Simpson's paradox: four income groups x two MUQ formulations</w:t>
-            </w:r>
-          </w:p>
-        </w:tc>
-        <w:tc>
-          <w:tcPr>
-            <w:tcW w:type="dxa" w:w="3135"/>
-          </w:tcPr>
-          <w:p>
-            <w:r>
-              <w:t>Core finding -- identical to Nature version</w:t>
-            </w:r>
-          </w:p>
-        </w:tc>
-      </w:tr>
-      <w:tr>
-        <w:tc>
-          <w:tcPr>
-            <w:tcW w:type="dxa" w:w="3135"/>
-          </w:tcPr>
-          <w:p>
-            <w:r>
-              <w:t>Fig. 2</w:t>
-            </w:r>
-          </w:p>
-        </w:tc>
-        <w:tc>
-          <w:tcPr>
-            <w:tcW w:type="dxa" w:w="3135"/>
-          </w:tcPr>
-          <w:p>
-            <w:r>
-              <w:t>Aggregation trap theorem schematic + empirical verification</w:t>
-            </w:r>
-          </w:p>
-        </w:tc>
-        <w:tc>
-          <w:tcPr>
-            <w:tcW w:type="dxa" w:w="3135"/>
-          </w:tcPr>
-          <w:p>
-            <w:r>
-              <w:t>Theoretical contribution</w:t>
-            </w:r>
-          </w:p>
-        </w:tc>
-      </w:tr>
-      <w:tr>
-        <w:tc>
-          <w:tcPr>
-            <w:tcW w:type="dxa" w:w="3135"/>
-          </w:tcPr>
-          <w:p>
-            <w:r>
-              <w:t>Fig. 3</w:t>
-            </w:r>
-          </w:p>
-        </w:tc>
-        <w:tc>
-          <w:tcPr>
-            <w:tcW w:type="dxa" w:w="3135"/>
-          </w:tcPr>
-          <w:p>
-            <w:r>
-              <w:t>Japan 67-year MUQ trajectory with structural breaks and hierarchy gradient</w:t>
-            </w:r>
-          </w:p>
-        </w:tc>
-        <w:tc>
-          <w:tcPr>
-            <w:tcW w:type="dxa" w:w="3135"/>
-          </w:tcPr>
-          <w:p>
-            <w:r>
-              <w:t>Key reference trajectory for urban science</w:t>
-            </w:r>
-          </w:p>
-        </w:tc>
-      </w:tr>
-      <w:tr>
-        <w:tc>
-          <w:tcPr>
-            <w:tcW w:type="dxa" w:w="3135"/>
-          </w:tcPr>
-          <w:p>
-            <w:r>
-              <w:t>Fig. 4</w:t>
-            </w:r>
-          </w:p>
-        </w:tc>
-        <w:tc>
-          <w:tcPr>
-            <w:tcW w:type="dxa" w:w="3135"/>
-          </w:tcPr>
-          <w:p>
-            <w:r>
-              <w:t>Three crisis-recovery archetypes: Japan (L-shaped), Korea (V-shaped), PIIGS (mixed)</w:t>
-            </w:r>
-          </w:p>
-        </w:tc>
-        <w:tc>
-          <w:tcPr>
-            <w:tcW w:type="dxa" w:w="3135"/>
-          </w:tcPr>
-          <w:p>
-            <w:r>
-              <w:t>Multi-country institutional comparison</w:t>
-            </w:r>
-          </w:p>
-        </w:tc>
-      </w:tr>
-      <w:tr>
-        <w:tc>
-          <w:tcPr>
-            <w:tcW w:type="dxa" w:w="3135"/>
-          </w:tcPr>
-          <w:p>
-            <w:r>
-              <w:t>Fig. 5</w:t>
-            </w:r>
-          </w:p>
-        </w:tc>
-        <w:tc>
-          <w:tcPr>
-            <w:tcW w:type="dxa" w:w="3135"/>
-          </w:tcPr>
-          <w:p>
-            <w:r>
-              <w:t>China--Japan mirror: MUQ aligned by urbanisation rate with investment intensity overlay</w:t>
-            </w:r>
-          </w:p>
-        </w:tc>
-        <w:tc>
-          <w:tcPr>
-            <w:tcW w:type="dxa" w:w="3135"/>
-          </w:tcPr>
-          <w:p>
-            <w:r>
-              <w:t>Central comparative finding</w:t>
-            </w:r>
-          </w:p>
-        </w:tc>
-      </w:tr>
-      <w:tr>
-        <w:tc>
-          <w:tcPr>
-            <w:tcW w:type="dxa" w:w="3135"/>
-          </w:tcPr>
-          <w:p>
-            <w:r>
-              <w:t>Fig. 6</w:t>
-            </w:r>
-          </w:p>
-        </w:tc>
-        <w:tc>
-          <w:tcPr>
-            <w:tcW w:type="dxa" w:w="3135"/>
-          </w:tcPr>
-          <w:p>
-            <w:r>
-              <w:t>Europe 265 NUTS-2: East-West MUQ dynamics and convergence</w:t>
-            </w:r>
-          </w:p>
-        </w:tc>
-        <w:tc>
-          <w:tcPr>
-            <w:tcW w:type="dxa" w:w="3135"/>
-          </w:tcPr>
-          <w:p>
-            <w:r>
-              <w:t>Geographic breadth</w:t>
-            </w:r>
-          </w:p>
-        </w:tc>
-      </w:tr>
-      <w:tr>
-        <w:tc>
-          <w:tcPr>
-            <w:tcW w:type="dxa" w:w="3135"/>
-          </w:tcPr>
-          <w:p>
-            <w:r>
-              <w:t>Fig. 7</w:t>
-            </w:r>
-          </w:p>
-        </w:tc>
-        <w:tc>
-          <w:tcPr>
-            <w:tcW w:type="dxa" w:w="3135"/>
-          </w:tcPr>
-          <w:p>
-            <w:r>
-              <w:t>Carbon period decomposition + physical cross-validation</w:t>
-            </w:r>
-          </w:p>
-        </w:tc>
-        <w:tc>
-          <w:tcPr>
-            <w:tcW w:type="dxa" w:w="3135"/>
-          </w:tcPr>
-          <w:p>
-            <w:r>
-              <w:t>Restored finding (NC-specific)</w:t>
-            </w:r>
-          </w:p>
-        </w:tc>
-      </w:tr>
-      <w:tr>
-        <w:tc>
-          <w:tcPr>
-            <w:tcW w:type="dxa" w:w="3135"/>
-          </w:tcPr>
-          <w:p>
-            <w:r>
-              <w:t>Fig. 8</w:t>
-            </w:r>
-          </w:p>
-        </w:tc>
-        <w:tc>
-          <w:tcPr>
-            <w:tcW w:type="dxa" w:w="3135"/>
-          </w:tcPr>
-          <w:p>
-            <w:r>
-              <w:t>Policy framework: city-tier MUQ gradient with intervention thresholds</w:t>
-            </w:r>
-          </w:p>
-        </w:tc>
-        <w:tc>
-          <w:tcPr>
-            <w:tcW w:type="dxa" w:w="3135"/>
-          </w:tcPr>
-          <w:p>
-            <w:r>
-              <w:t>Policy translation (NC-specific)</w:t>
-            </w:r>
-          </w:p>
-        </w:tc>
-      </w:tr>
-    </w:tbl>
     <w:p>
       <w:pPr>
         <w:pStyle w:val="Heading2"/>
@@ -2059,303 +1076,6 @@
         <w:t>Word Count</w:t>
       </w:r>
     </w:p>
-    <w:tbl>
-      <w:tblPr>
-        <w:tblStyle w:val="LightGrid-Accent1"/>
-        <w:tblW w:type="auto" w:w="0"/>
-        <w:tblLook w:firstColumn="1" w:firstRow="1" w:lastColumn="0" w:lastRow="0" w:noHBand="0" w:noVBand="1" w:val="04A0"/>
-      </w:tblPr>
-      <w:tblGrid>
-        <w:gridCol w:w="4703"/>
-        <w:gridCol w:w="4703"/>
-      </w:tblGrid>
-      <w:tr>
-        <w:tc>
-          <w:tcPr>
-            <w:tcW w:type="dxa" w:w="4703"/>
-          </w:tcPr>
-          <w:p>
-            <w:r>
-              <w:t>Section</w:t>
-            </w:r>
-          </w:p>
-        </w:tc>
-        <w:tc>
-          <w:tcPr>
-            <w:tcW w:type="dxa" w:w="4703"/>
-          </w:tcPr>
-          <w:p>
-            <w:r>
-              <w:t>Words (est.)</w:t>
-            </w:r>
-          </w:p>
-        </w:tc>
-      </w:tr>
-      <w:tr>
-        <w:tc>
-          <w:tcPr>
-            <w:tcW w:type="dxa" w:w="4703"/>
-          </w:tcPr>
-          <w:p>
-            <w:r>
-              <w:t>Abstract</w:t>
-            </w:r>
-          </w:p>
-        </w:tc>
-        <w:tc>
-          <w:tcPr>
-            <w:tcW w:type="dxa" w:w="4703"/>
-          </w:tcPr>
-          <w:p>
-            <w:r>
-              <w:t>~220</w:t>
-            </w:r>
-          </w:p>
-        </w:tc>
-      </w:tr>
-      <w:tr>
-        <w:tc>
-          <w:tcPr>
-            <w:tcW w:type="dxa" w:w="4703"/>
-          </w:tcPr>
-          <w:p>
-            <w:r>
-              <w:t>Introduction</w:t>
-            </w:r>
-          </w:p>
-        </w:tc>
-        <w:tc>
-          <w:tcPr>
-            <w:tcW w:type="dxa" w:w="4703"/>
-          </w:tcPr>
-          <w:p>
-            <w:r>
-              <w:t>~780</w:t>
-            </w:r>
-          </w:p>
-        </w:tc>
-      </w:tr>
-      <w:tr>
-        <w:tc>
-          <w:tcPr>
-            <w:tcW w:type="dxa" w:w="4703"/>
-          </w:tcPr>
-          <w:p>
-            <w:r>
-              <w:t>Finding 1</w:t>
-            </w:r>
-          </w:p>
-        </w:tc>
-        <w:tc>
-          <w:tcPr>
-            <w:tcW w:type="dxa" w:w="4703"/>
-          </w:tcPr>
-          <w:p>
-            <w:r>
-              <w:t>~560</w:t>
-            </w:r>
-          </w:p>
-        </w:tc>
-      </w:tr>
-      <w:tr>
-        <w:tc>
-          <w:tcPr>
-            <w:tcW w:type="dxa" w:w="4703"/>
-          </w:tcPr>
-          <w:p>
-            <w:r>
-              <w:t>Finding 2</w:t>
-            </w:r>
-          </w:p>
-        </w:tc>
-        <w:tc>
-          <w:tcPr>
-            <w:tcW w:type="dxa" w:w="4703"/>
-          </w:tcPr>
-          <w:p>
-            <w:r>
-              <w:t>~1,050</w:t>
-            </w:r>
-          </w:p>
-        </w:tc>
-      </w:tr>
-      <w:tr>
-        <w:tc>
-          <w:tcPr>
-            <w:tcW w:type="dxa" w:w="4703"/>
-          </w:tcPr>
-          <w:p>
-            <w:r>
-              <w:t>Finding 3</w:t>
-            </w:r>
-          </w:p>
-        </w:tc>
-        <w:tc>
-          <w:tcPr>
-            <w:tcW w:type="dxa" w:w="4703"/>
-          </w:tcPr>
-          <w:p>
-            <w:r>
-              <w:t>~470</w:t>
-            </w:r>
-          </w:p>
-        </w:tc>
-      </w:tr>
-      <w:tr>
-        <w:tc>
-          <w:tcPr>
-            <w:tcW w:type="dxa" w:w="4703"/>
-          </w:tcPr>
-          <w:p>
-            <w:r>
-              <w:t>Box 1</w:t>
-            </w:r>
-          </w:p>
-        </w:tc>
-        <w:tc>
-          <w:tcPr>
-            <w:tcW w:type="dxa" w:w="4703"/>
-          </w:tcPr>
-          <w:p>
-            <w:r>
-              <w:t>~470</w:t>
-            </w:r>
-          </w:p>
-        </w:tc>
-      </w:tr>
-      <w:tr>
-        <w:tc>
-          <w:tcPr>
-            <w:tcW w:type="dxa" w:w="4703"/>
-          </w:tcPr>
-          <w:p>
-            <w:r>
-              <w:t>Discussion</w:t>
-            </w:r>
-          </w:p>
-        </w:tc>
-        <w:tc>
-          <w:tcPr>
-            <w:tcW w:type="dxa" w:w="4703"/>
-          </w:tcPr>
-          <w:p>
-            <w:r>
-              <w:t>~1,100</w:t>
-            </w:r>
-          </w:p>
-        </w:tc>
-      </w:tr>
-      <w:tr>
-        <w:tc>
-          <w:tcPr>
-            <w:tcW w:type="dxa" w:w="4703"/>
-          </w:tcPr>
-          <w:p>
-            <w:r>
-              <w:t>**Main text + Box 1**</w:t>
-            </w:r>
-          </w:p>
-        </w:tc>
-        <w:tc>
-          <w:tcPr>
-            <w:tcW w:type="dxa" w:w="4703"/>
-          </w:tcPr>
-          <w:p>
-            <w:r>
-              <w:t>**~4,650**</w:t>
-            </w:r>
-          </w:p>
-        </w:tc>
-      </w:tr>
-      <w:tr>
-        <w:tc>
-          <w:tcPr>
-            <w:tcW w:type="dxa" w:w="4703"/>
-          </w:tcPr>
-          <w:p>
-            <w:r>
-              <w:t>Methods (M1--M10)</w:t>
-            </w:r>
-          </w:p>
-        </w:tc>
-        <w:tc>
-          <w:tcPr>
-            <w:tcW w:type="dxa" w:w="4703"/>
-          </w:tcPr>
-          <w:p>
-            <w:r>
-              <w:t>~1,450</w:t>
-            </w:r>
-          </w:p>
-        </w:tc>
-      </w:tr>
-      <w:tr>
-        <w:tc>
-          <w:tcPr>
-            <w:tcW w:type="dxa" w:w="4703"/>
-          </w:tcPr>
-          <w:p>
-            <w:r>
-              <w:t>**Full text (Main + Box 1 + Methods)**</w:t>
-            </w:r>
-          </w:p>
-        </w:tc>
-        <w:tc>
-          <w:tcPr>
-            <w:tcW w:type="dxa" w:w="4703"/>
-          </w:tcPr>
-          <w:p>
-            <w:r>
-              <w:t>**~6,100**</w:t>
-            </w:r>
-          </w:p>
-        </w:tc>
-      </w:tr>
-      <w:tr>
-        <w:tc>
-          <w:tcPr>
-            <w:tcW w:type="dxa" w:w="4703"/>
-          </w:tcPr>
-          <w:p>
-            <w:r>
-              <w:t>References</w:t>
-            </w:r>
-          </w:p>
-        </w:tc>
-        <w:tc>
-          <w:tcPr>
-            <w:tcW w:type="dxa" w:w="4703"/>
-          </w:tcPr>
-          <w:p>
-            <w:r>
-              <w:t>50</w:t>
-            </w:r>
-          </w:p>
-        </w:tc>
-      </w:tr>
-    </w:tbl>
-    <w:p>
-      <w:r>
-        <w:br w:type="page"/>
-      </w:r>
-    </w:p>
-    <w:p>
-      <w:pPr>
-        <w:pStyle w:val="Heading1"/>
-      </w:pPr>
-      <w:r>
-        <w:t>Extended Data Figures</w:t>
-      </w:r>
-    </w:p>
-    <w:p>
-      <w:r>
-        <w:rPr>
-          <w:b/>
-          <w:sz w:val="20"/>
-        </w:rPr>
-        <w:t>Extended Data Figure 1</w:t>
-      </w:r>
-    </w:p>
     <w:p>
       <w:pPr>
         <w:jc w:val="center"/>
@@ -2363,7 +1083,7 @@
       <w:r>
         <w:drawing>
           <wp:inline xmlns:a="http://schemas.openxmlformats.org/drawingml/2006/main" xmlns:pic="http://schemas.openxmlformats.org/drawingml/2006/picture">
-            <wp:extent cx="5029200" cy="2038162"/>
+            <wp:extent cx="5029200" cy="2189487"/>
             <wp:docPr id="2" name="Picture 2"/>
             <wp:cNvGraphicFramePr>
               <a:graphicFrameLocks noChangeAspect="1"/>
@@ -2372,7 +1092,7 @@
               <a:graphicData uri="http://schemas.openxmlformats.org/drawingml/2006/picture">
                 <pic:pic>
                   <pic:nvPicPr>
-                    <pic:cNvPr id="0" name="ed_fig_01.png"/>
+                    <pic:cNvPr id="0" name="fig01_simpson_paradox.png"/>
                     <pic:cNvPicPr/>
                   </pic:nvPicPr>
                   <pic:blipFill>
@@ -2384,7 +1104,7 @@
                   <pic:spPr>
                     <a:xfrm>
                       <a:off x="0" y="0"/>
-                      <a:ext cx="5029200" cy="2038162"/>
+                      <a:ext cx="5029200" cy="2189487"/>
                     </a:xfrm>
                     <a:prstGeom prst="rect"/>
                   </pic:spPr>
@@ -2395,16 +1115,22 @@
         </w:drawing>
       </w:r>
     </w:p>
-    <w:p/>
     <w:p>
       <w:r>
         <w:rPr>
           <w:b/>
-          <w:sz w:val="20"/>
+          <w:sz w:val="18"/>
         </w:rPr>
-        <w:t>Extended Data Figure 2</w:t>
+        <w:t xml:space="preserve">Figure 1 | </w:t>
+      </w:r>
+      <w:r>
+        <w:rPr>
+          <w:sz w:val="18"/>
+        </w:rPr>
+        <w:t>Simpson's paradox in global urban investment efficiency.</w:t>
       </w:r>
     </w:p>
+    <w:p/>
     <w:p>
       <w:pPr>
         <w:jc w:val="center"/>
@@ -2412,7 +1138,7 @@
       <w:r>
         <w:drawing>
           <wp:inline xmlns:a="http://schemas.openxmlformats.org/drawingml/2006/main" xmlns:pic="http://schemas.openxmlformats.org/drawingml/2006/picture">
-            <wp:extent cx="5029200" cy="3451212"/>
+            <wp:extent cx="5029200" cy="3966342"/>
             <wp:docPr id="3" name="Picture 3"/>
             <wp:cNvGraphicFramePr>
               <a:graphicFrameLocks noChangeAspect="1"/>
@@ -2421,7 +1147,7 @@
               <a:graphicData uri="http://schemas.openxmlformats.org/drawingml/2006/picture">
                 <pic:pic>
                   <pic:nvPicPr>
-                    <pic:cNvPr id="0" name="ed_fig_02.png"/>
+                    <pic:cNvPr id="0" name="ed_fig_08.png"/>
                     <pic:cNvPicPr/>
                   </pic:nvPicPr>
                   <pic:blipFill>
@@ -2433,7 +1159,7 @@
                   <pic:spPr>
                     <a:xfrm>
                       <a:off x="0" y="0"/>
-                      <a:ext cx="5029200" cy="3451212"/>
+                      <a:ext cx="5029200" cy="3966342"/>
                     </a:xfrm>
                     <a:prstGeom prst="rect"/>
                   </pic:spPr>
@@ -2444,16 +1170,22 @@
         </w:drawing>
       </w:r>
     </w:p>
-    <w:p/>
     <w:p>
       <w:r>
         <w:rPr>
           <w:b/>
-          <w:sz w:val="20"/>
+          <w:sz w:val="18"/>
         </w:rPr>
-        <w:t>Extended Data Figure 3</w:t>
+        <w:t xml:space="preserve">Figure 2 | </w:t>
+      </w:r>
+      <w:r>
+        <w:rPr>
+          <w:sz w:val="18"/>
+        </w:rPr>
+        <w:t>Aggregation Trap theorem: schematic and empirical verification.</w:t>
       </w:r>
     </w:p>
+    <w:p/>
     <w:p>
       <w:pPr>
         <w:jc w:val="center"/>
@@ -2493,16 +1225,22 @@
         </w:drawing>
       </w:r>
     </w:p>
-    <w:p/>
     <w:p>
       <w:r>
         <w:rPr>
           <w:b/>
-          <w:sz w:val="20"/>
+          <w:sz w:val="18"/>
         </w:rPr>
-        <w:t>Extended Data Figure 4</w:t>
+        <w:t xml:space="preserve">Figure 3 | </w:t>
+      </w:r>
+      <w:r>
+        <w:rPr>
+          <w:sz w:val="18"/>
+        </w:rPr>
+        <w:t>China-Japan mirror: MUQ aligned by urbanisation rate.</w:t>
       </w:r>
     </w:p>
+    <w:p/>
     <w:p>
       <w:pPr>
         <w:jc w:val="center"/>
@@ -2542,16 +1280,22 @@
         </w:drawing>
       </w:r>
     </w:p>
-    <w:p/>
     <w:p>
       <w:r>
         <w:rPr>
           <w:b/>
-          <w:sz w:val="20"/>
+          <w:sz w:val="18"/>
         </w:rPr>
-        <w:t>Extended Data Figure 5</w:t>
+        <w:t xml:space="preserve">Figure 4 | </w:t>
+      </w:r>
+      <w:r>
+        <w:rPr>
+          <w:sz w:val="18"/>
+        </w:rPr>
+        <w:t>Three crisis-recovery archetypes: Japan, Korea, PIIGS.</w:t>
       </w:r>
     </w:p>
+    <w:p/>
     <w:p>
       <w:pPr>
         <w:jc w:val="center"/>
@@ -2559,7 +1303,7 @@
       <w:r>
         <w:drawing>
           <wp:inline xmlns:a="http://schemas.openxmlformats.org/drawingml/2006/main" xmlns:pic="http://schemas.openxmlformats.org/drawingml/2006/picture">
-            <wp:extent cx="5029200" cy="2198945"/>
+            <wp:extent cx="5029200" cy="3451212"/>
             <wp:docPr id="6" name="Picture 6"/>
             <wp:cNvGraphicFramePr>
               <a:graphicFrameLocks noChangeAspect="1"/>
@@ -2568,7 +1312,7 @@
               <a:graphicData uri="http://schemas.openxmlformats.org/drawingml/2006/picture">
                 <pic:pic>
                   <pic:nvPicPr>
-                    <pic:cNvPr id="0" name="ed_fig_05.png"/>
+                    <pic:cNvPr id="0" name="ed_fig_02.png"/>
                     <pic:cNvPicPr/>
                   </pic:nvPicPr>
                   <pic:blipFill>
@@ -2580,7 +1324,7 @@
                   <pic:spPr>
                     <a:xfrm>
                       <a:off x="0" y="0"/>
-                      <a:ext cx="5029200" cy="2198945"/>
+                      <a:ext cx="5029200" cy="3451212"/>
                     </a:xfrm>
                     <a:prstGeom prst="rect"/>
                   </pic:spPr>
@@ -2591,16 +1335,22 @@
         </w:drawing>
       </w:r>
     </w:p>
-    <w:p/>
     <w:p>
       <w:r>
         <w:rPr>
           <w:b/>
-          <w:sz w:val="20"/>
+          <w:sz w:val="18"/>
         </w:rPr>
-        <w:t>Extended Data Figure 6</w:t>
+        <w:t xml:space="preserve">Figure 5 | </w:t>
+      </w:r>
+      <w:r>
+        <w:rPr>
+          <w:sz w:val="18"/>
+        </w:rPr>
+        <w:t>Unified regional panel: 1,567 regions across eight countries.</w:t>
       </w:r>
     </w:p>
+    <w:p/>
     <w:p>
       <w:pPr>
         <w:jc w:val="center"/>
@@ -2640,16 +1390,22 @@
         </w:drawing>
       </w:r>
     </w:p>
-    <w:p/>
     <w:p>
       <w:r>
         <w:rPr>
           <w:b/>
-          <w:sz w:val="20"/>
+          <w:sz w:val="18"/>
         </w:rPr>
-        <w:t>Extended Data Figure 7</w:t>
+        <w:t xml:space="preserve">Figure 6 | </w:t>
+      </w:r>
+      <w:r>
+        <w:rPr>
+          <w:sz w:val="18"/>
+        </w:rPr>
+        <w:t>Europe 265 NUTS-2: East-West convergence dynamics.</w:t>
       </w:r>
     </w:p>
+    <w:p/>
     <w:p>
       <w:pPr>
         <w:jc w:val="center"/>
@@ -2657,7 +1413,7 @@
       <w:r>
         <w:drawing>
           <wp:inline xmlns:a="http://schemas.openxmlformats.org/drawingml/2006/main" xmlns:pic="http://schemas.openxmlformats.org/drawingml/2006/picture">
-            <wp:extent cx="5029200" cy="3451212"/>
+            <wp:extent cx="5029200" cy="2198945"/>
             <wp:docPr id="8" name="Picture 8"/>
             <wp:cNvGraphicFramePr>
               <a:graphicFrameLocks noChangeAspect="1"/>
@@ -2666,7 +1422,7 @@
               <a:graphicData uri="http://schemas.openxmlformats.org/drawingml/2006/picture">
                 <pic:pic>
                   <pic:nvPicPr>
-                    <pic:cNvPr id="0" name="ed_fig_07.png"/>
+                    <pic:cNvPr id="0" name="ed_fig_05.png"/>
                     <pic:cNvPicPr/>
                   </pic:nvPicPr>
                   <pic:blipFill>
@@ -2678,7 +1434,7 @@
                   <pic:spPr>
                     <a:xfrm>
                       <a:off x="0" y="0"/>
-                      <a:ext cx="5029200" cy="3451212"/>
+                      <a:ext cx="5029200" cy="2198945"/>
                     </a:xfrm>
                     <a:prstGeom prst="rect"/>
                   </pic:spPr>
@@ -2689,14 +1445,33 @@
         </w:drawing>
       </w:r>
     </w:p>
-    <w:p/>
     <w:p>
       <w:r>
         <w:rPr>
           <w:b/>
-          <w:sz w:val="20"/>
+          <w:sz w:val="18"/>
         </w:rPr>
-        <w:t>Extended Data Figure 8</w:t>
+        <w:t xml:space="preserve">Figure 7 | </w:t>
+      </w:r>
+      <w:r>
+        <w:rPr>
+          <w:sz w:val="18"/>
+        </w:rPr>
+        <w:t>beta_V decomposition: mechanical versus economic signal.</w:t>
+      </w:r>
+    </w:p>
+    <w:p/>
+    <w:p>
+      <w:r>
+        <w:br w:type="page"/>
+      </w:r>
+    </w:p>
+    <w:p>
+      <w:pPr>
+        <w:pStyle w:val="Heading1"/>
+      </w:pPr>
+      <w:r>
+        <w:t>Extended Data Figures</w:t>
       </w:r>
     </w:p>
     <w:p>
@@ -2706,7 +1481,7 @@
       <w:r>
         <w:drawing>
           <wp:inline xmlns:a="http://schemas.openxmlformats.org/drawingml/2006/main" xmlns:pic="http://schemas.openxmlformats.org/drawingml/2006/picture">
-            <wp:extent cx="5029200" cy="3966342"/>
+            <wp:extent cx="5029200" cy="2038162"/>
             <wp:docPr id="9" name="Picture 9"/>
             <wp:cNvGraphicFramePr>
               <a:graphicFrameLocks noChangeAspect="1"/>
@@ -2715,7 +1490,7 @@
               <a:graphicData uri="http://schemas.openxmlformats.org/drawingml/2006/picture">
                 <pic:pic>
                   <pic:nvPicPr>
-                    <pic:cNvPr id="0" name="ed_fig_08.png"/>
+                    <pic:cNvPr id="0" name="ed_fig_01.png"/>
                     <pic:cNvPicPr/>
                   </pic:nvPicPr>
                   <pic:blipFill>
@@ -2727,7 +1502,7 @@
                   <pic:spPr>
                     <a:xfrm>
                       <a:off x="0" y="0"/>
-                      <a:ext cx="5029200" cy="3966342"/>
+                      <a:ext cx="5029200" cy="2038162"/>
                     </a:xfrm>
                     <a:prstGeom prst="rect"/>
                   </pic:spPr>
@@ -2738,16 +1513,22 @@
         </w:drawing>
       </w:r>
     </w:p>
-    <w:p/>
     <w:p>
       <w:r>
         <w:rPr>
           <w:b/>
-          <w:sz w:val="20"/>
+          <w:sz w:val="18"/>
         </w:rPr>
-        <w:t>Extended Data Figure 9</w:t>
+        <w:t xml:space="preserve">Extended Data Figure 1 | </w:t>
+      </w:r>
+      <w:r>
+        <w:rPr>
+          <w:sz w:val="18"/>
+        </w:rPr>
+        <w:t>GDP-based MUQ by income group and urbanisation stage.</w:t>
       </w:r>
     </w:p>
+    <w:p/>
     <w:p>
       <w:pPr>
         <w:jc w:val="center"/>
@@ -2787,16 +1568,22 @@
         </w:drawing>
       </w:r>
     </w:p>
-    <w:p/>
     <w:p>
       <w:r>
         <w:rPr>
           <w:b/>
-          <w:sz w:val="20"/>
+          <w:sz w:val="18"/>
         </w:rPr>
-        <w:t>Extended Data Figure 10</w:t>
+        <w:t xml:space="preserve">Extended Data Figure 2 | </w:t>
+      </w:r>
+      <w:r>
+        <w:rPr>
+          <w:sz w:val="18"/>
+        </w:rPr>
+        <w:t>Ten-country MUQ trajectories (1960-2022).</w:t>
       </w:r>
     </w:p>
+    <w:p/>
     <w:p>
       <w:pPr>
         <w:jc w:val="center"/>
@@ -2834,6 +1621,21 @@
             </a:graphic>
           </wp:inline>
         </w:drawing>
+      </w:r>
+    </w:p>
+    <w:p>
+      <w:r>
+        <w:rPr>
+          <w:b/>
+          <w:sz w:val="18"/>
+        </w:rPr>
+        <w:t xml:space="preserve">Extended Data Figure 3 | </w:t>
+      </w:r>
+      <w:r>
+        <w:rPr>
+          <w:sz w:val="18"/>
+        </w:rPr>
+        <w:t>DID event study with diagnostic warnings.</w:t>
       </w:r>
     </w:p>
     <w:p/>
@@ -3215,7 +2017,7 @@
     </w:pPr>
     <w:rPr>
       <w:rFonts w:ascii="Times New Roman" w:hAnsi="Times New Roman"/>
-      <w:sz w:val="16"/>
+      <w:sz w:val="22"/>
     </w:rPr>
   </w:style>
   <w:style w:type="paragraph" w:styleId="Header">

</xml_diff>